<commit_message>
Updated ECRMDP project charter
</commit_message>
<xml_diff>
--- a/docs/ECRMDP_Project_Charter.docx
+++ b/docs/ECRMDP_Project_Charter.docx
@@ -202,7 +202,15 @@
                 <w:sz w:val="24"/>
                 <w:szCs w:val="24"/>
               </w:rPr>
-              <w:t>Project Title</w:t>
+              <w:t xml:space="preserve">Project </w:t>
+            </w:r>
+            <w:r>
+              <w:rPr>
+                <w:color w:val="000000" w:themeColor="text1"/>
+                <w:sz w:val="24"/>
+                <w:szCs w:val="24"/>
+              </w:rPr>
+              <w:t>Purpose</w:t>
             </w:r>
           </w:p>
         </w:tc>
@@ -365,13 +373,23 @@
                 <w:szCs w:val="24"/>
               </w:rPr>
             </w:pPr>
+            <w:proofErr w:type="spellStart"/>
             <w:r>
               <w:rPr>
                 <w:color w:val="000000" w:themeColor="text1"/>
                 <w:sz w:val="24"/>
                 <w:szCs w:val="24"/>
               </w:rPr>
-              <w:t>Sriviknesh • Sharan • Sidharth</w:t>
+              <w:t>Sriviknesh</w:t>
+            </w:r>
+            <w:proofErr w:type="spellEnd"/>
+            <w:r>
+              <w:rPr>
+                <w:color w:val="000000" w:themeColor="text1"/>
+                <w:sz w:val="24"/>
+                <w:szCs w:val="24"/>
+              </w:rPr>
+              <w:t xml:space="preserve"> • Sharan • Sidharth</w:t>
             </w:r>
           </w:p>
         </w:tc>
@@ -463,13 +481,23 @@
                 <w:szCs w:val="24"/>
               </w:rPr>
             </w:pPr>
+            <w:proofErr w:type="spellStart"/>
             <w:r>
               <w:rPr>
                 <w:color w:val="000000" w:themeColor="text1"/>
                 <w:sz w:val="24"/>
                 <w:szCs w:val="24"/>
               </w:rPr>
-              <w:t>Sriviknesh – Business, Architecture &amp; Documentation</w:t>
+              <w:t>Sriviknesh</w:t>
+            </w:r>
+            <w:proofErr w:type="spellEnd"/>
+            <w:r>
+              <w:rPr>
+                <w:color w:val="000000" w:themeColor="text1"/>
+                <w:sz w:val="24"/>
+                <w:szCs w:val="24"/>
+              </w:rPr>
+              <w:t xml:space="preserve"> – Business, Architecture &amp; Documentation</w:t>
             </w:r>
           </w:p>
         </w:tc>
@@ -549,99 +577,6 @@
           <w:color w:val="000000" w:themeColor="text1"/>
         </w:rPr>
         <w:lastRenderedPageBreak/>
-        <w:t>1. Executive Summary</w:t>
-      </w:r>
-    </w:p>
-    <w:p>
-      <w:pPr>
-        <w:rPr>
-          <w:color w:val="000000" w:themeColor="text1"/>
-        </w:rPr>
-      </w:pPr>
-      <w:r>
-        <w:rPr>
-          <w:color w:val="000000" w:themeColor="text1"/>
-        </w:rPr>
-        <w:t>The ECRMDP project is an Enterprise Customer Relationship Management Data Platform intended to build a unified Customer 360 and Sales Analytics platform for ABC Global Solutions Ltd. Customer interactions are distributed across multiple CRM and digital channels, making it difficult to obtain a unified customer view, track customer journeys, measure sales and marketing performance, and generate enterprise-wide insights.</w:t>
-      </w:r>
-    </w:p>
-    <w:p>
-      <w:pPr>
-        <w:rPr>
-          <w:color w:val="000000" w:themeColor="text1"/>
-        </w:rPr>
-      </w:pPr>
-      <w:r>
-        <w:rPr>
-          <w:color w:val="000000" w:themeColor="text1"/>
-        </w:rPr>
-        <w:t>The project establishes an end-to-end data engineering platform that collects customer and sales data from multiple sources, validates and standardizes the data, stores curated information in PostgreSQL, maintains metadata, audit logs and lineage, and supports analytics and executive reporting.</w:t>
-      </w:r>
-    </w:p>
-    <w:p>
-      <w:pPr>
-        <w:rPr>
-          <w:color w:val="000000" w:themeColor="text1"/>
-        </w:rPr>
-      </w:pPr>
-      <w:r>
-        <w:rPr>
-          <w:color w:val="000000" w:themeColor="text1"/>
-        </w:rPr>
-        <w:t>The architecture follows a Bronze → Silver → Gold pattern: source systems feed Pentaho ETL, raw data is landed in PostgreSQL Bronze staging, Python/Pandas supports profiling and quality processing in Silver, curated data is organized in a PostgreSQL Gold warehouse, and Power BI provides dashboards and Customer 360 analytics.</w:t>
-      </w:r>
-    </w:p>
-    <w:p>
-      <w:pPr>
-        <w:pStyle w:val="Heading1"/>
-        <w:rPr>
-          <w:color w:val="000000" w:themeColor="text1"/>
-        </w:rPr>
-      </w:pPr>
-      <w:r>
-        <w:rPr>
-          <w:color w:val="000000" w:themeColor="text1"/>
-        </w:rPr>
-        <w:t>Business Background</w:t>
-      </w:r>
-    </w:p>
-    <w:p>
-      <w:pPr>
-        <w:rPr>
-          <w:color w:val="000000" w:themeColor="text1"/>
-        </w:rPr>
-      </w:pPr>
-      <w:r>
-        <w:rPr>
-          <w:color w:val="000000" w:themeColor="text1"/>
-        </w:rPr>
-        <w:t>ABC Global Solutions Ltd. manages customer interactions across Sales, Marketing, Customer Support, Service Operations and Digital Channels. The project specification identifies Customer Master, Lead Management, Opportunity Management, Sales Pipeline, Marketing Campaigns, Customer Support, Service Requests, Contact Center, Website, Mobile Applications and Social Media integrations as CRM/digital data sources.</w:t>
-      </w:r>
-    </w:p>
-    <w:p>
-      <w:pPr>
-        <w:rPr>
-          <w:color w:val="000000" w:themeColor="text1"/>
-        </w:rPr>
-      </w:pPr>
-      <w:r>
-        <w:rPr>
-          <w:color w:val="000000" w:themeColor="text1"/>
-        </w:rPr>
-        <w:t>Because these systems operate across different business functions, customer and sales information is fragmented. The organization faces challenges in obtaining a unified customer view, tracking customer journeys, measuring sales performance, improving customer satisfaction, optimizing marketing campaigns and generating enterprise-wide insights.</w:t>
-      </w:r>
-    </w:p>
-    <w:p>
-      <w:pPr>
-        <w:pStyle w:val="Heading1"/>
-        <w:rPr>
-          <w:color w:val="000000" w:themeColor="text1"/>
-        </w:rPr>
-      </w:pPr>
-      <w:r>
-        <w:rPr>
-          <w:color w:val="000000" w:themeColor="text1"/>
-        </w:rPr>
         <w:t xml:space="preserve">1. </w:t>
       </w:r>
       <w:r>
@@ -805,7 +740,6 @@
         <w:rPr>
           <w:color w:val="000000" w:themeColor="text1"/>
         </w:rPr>
-        <w:lastRenderedPageBreak/>
         <w:t>3</w:t>
       </w:r>
       <w:r>
@@ -1118,6 +1052,7 @@
         <w:rPr>
           <w:color w:val="000000" w:themeColor="text1"/>
         </w:rPr>
+        <w:lastRenderedPageBreak/>
         <w:t>Source-to-target mapping and data lineage documentation.</w:t>
       </w:r>
     </w:p>
@@ -1400,7 +1335,6 @@
               <w:rPr>
                 <w:color w:val="000000" w:themeColor="text1"/>
               </w:rPr>
-              <w:lastRenderedPageBreak/>
               <w:t>Sprint 2 – Data Profiling &amp; DB / Data Warehouse</w:t>
             </w:r>
           </w:p>
@@ -2001,6 +1935,7 @@
         <w:rPr>
           <w:color w:val="000000" w:themeColor="text1"/>
         </w:rPr>
+        <w:lastRenderedPageBreak/>
         <w:t>7</w:t>
       </w:r>
       <w:r>
@@ -2200,7 +2135,21 @@
               <w:rPr>
                 <w:color w:val="000000" w:themeColor="text1"/>
               </w:rPr>
-              <w:t>Bronze staging and Gold warehouse</w:t>
+              <w:t xml:space="preserve">Bronze staging and </w:t>
+            </w:r>
+            <w:proofErr w:type="gramStart"/>
+            <w:r>
+              <w:rPr>
+                <w:color w:val="000000" w:themeColor="text1"/>
+              </w:rPr>
+              <w:t>Gold</w:t>
+            </w:r>
+            <w:proofErr w:type="gramEnd"/>
+            <w:r>
+              <w:rPr>
+                <w:color w:val="000000" w:themeColor="text1"/>
+              </w:rPr>
+              <w:t xml:space="preserve"> warehouse</w:t>
             </w:r>
           </w:p>
         </w:tc>
@@ -2636,7 +2585,6 @@
               <w:rPr>
                 <w:color w:val="000000" w:themeColor="text1"/>
               </w:rPr>
-              <w:lastRenderedPageBreak/>
               <w:t>Sales Management</w:t>
             </w:r>
           </w:p>
@@ -2949,12 +2897,14 @@
                 <w:color w:val="000000" w:themeColor="text1"/>
               </w:rPr>
             </w:pPr>
+            <w:proofErr w:type="spellStart"/>
             <w:r>
               <w:rPr>
                 <w:color w:val="000000" w:themeColor="text1"/>
               </w:rPr>
               <w:t>Sriviknesh</w:t>
             </w:r>
+            <w:proofErr w:type="spellEnd"/>
           </w:p>
         </w:tc>
         <w:tc>
@@ -3107,7 +3057,28 @@
               <w:rPr>
                 <w:color w:val="000000" w:themeColor="text1"/>
               </w:rPr>
-              <w:t>Source analysis; Data Dictionary; Source Inventory; PostgreSQL staging schema/DDL; source validation; staging verification; datasets/config/sql documentation.</w:t>
+              <w:t xml:space="preserve">Source analysis; Data Dictionary; Source Inventory; PostgreSQL staging schema/DDL; source </w:t>
+            </w:r>
+            <w:r>
+              <w:rPr>
+                <w:color w:val="000000" w:themeColor="text1"/>
+              </w:rPr>
+              <w:lastRenderedPageBreak/>
+              <w:t>validation; staging verification; datasets/config/</w:t>
+            </w:r>
+            <w:proofErr w:type="spellStart"/>
+            <w:r>
+              <w:rPr>
+                <w:color w:val="000000" w:themeColor="text1"/>
+              </w:rPr>
+              <w:t>sql</w:t>
+            </w:r>
+            <w:proofErr w:type="spellEnd"/>
+            <w:r>
+              <w:rPr>
+                <w:color w:val="000000" w:themeColor="text1"/>
+              </w:rPr>
+              <w:t xml:space="preserve"> documentation.</w:t>
             </w:r>
           </w:p>
         </w:tc>
@@ -3123,6 +3094,7 @@
         <w:rPr>
           <w:color w:val="000000" w:themeColor="text1"/>
         </w:rPr>
+        <w:lastRenderedPageBreak/>
         <w:t>The work plan states that responsibilities are divided by focus area, but all three members should understand the end-to-end platform.</w:t>
       </w:r>
     </w:p>
@@ -3383,14 +3355,7 @@
               <w:rPr>
                 <w:color w:val="000000" w:themeColor="text1"/>
               </w:rPr>
-              <w:t xml:space="preserve">Data Profiling &amp; DB / Data </w:t>
-            </w:r>
-            <w:r>
-              <w:rPr>
-                <w:color w:val="000000" w:themeColor="text1"/>
-              </w:rPr>
-              <w:lastRenderedPageBreak/>
-              <w:t>Warehouse</w:t>
+              <w:t>Data Profiling &amp; DB / Data Warehouse</w:t>
             </w:r>
           </w:p>
         </w:tc>
@@ -3408,15 +3373,7 @@
               <w:rPr>
                 <w:color w:val="000000" w:themeColor="text1"/>
               </w:rPr>
-              <w:lastRenderedPageBreak/>
-              <w:t xml:space="preserve">Python profiling; identify </w:t>
-            </w:r>
-            <w:r>
-              <w:rPr>
-                <w:color w:val="000000" w:themeColor="text1"/>
-              </w:rPr>
-              <w:lastRenderedPageBreak/>
-              <w:t>duplicates/missing/inconsistent data; cleansing; standardization; Star Schema; Fact/Dimension tables; warehouse loading; SQL reporting.</w:t>
+              <w:t>Python profiling; identify duplicates/missing/inconsistent data; cleansing; standardization; Star Schema; Fact/Dimension tables; warehouse loading; SQL reporting.</w:t>
             </w:r>
           </w:p>
         </w:tc>
@@ -3439,7 +3396,6 @@
               <w:rPr>
                 <w:color w:val="000000" w:themeColor="text1"/>
               </w:rPr>
-              <w:lastRenderedPageBreak/>
               <w:t>Sprint 3</w:t>
             </w:r>
           </w:p>
@@ -3781,6 +3737,7 @@
         <w:rPr>
           <w:color w:val="000000" w:themeColor="text1"/>
         </w:rPr>
+        <w:lastRenderedPageBreak/>
         <w:t>1</w:t>
       </w:r>
       <w:r>
@@ -3807,7 +3764,21 @@
         <w:rPr>
           <w:color w:val="000000" w:themeColor="text1"/>
         </w:rPr>
-        <w:t>Required deliverables for Sprints 0–3 are produced and documented.</w:t>
+        <w:t xml:space="preserve">Required deliverables for Sprints 0–3 </w:t>
+      </w:r>
+      <w:proofErr w:type="gramStart"/>
+      <w:r>
+        <w:rPr>
+          <w:color w:val="000000" w:themeColor="text1"/>
+        </w:rPr>
+        <w:t>are</w:t>
+      </w:r>
+      <w:proofErr w:type="gramEnd"/>
+      <w:r>
+        <w:rPr>
+          <w:color w:val="000000" w:themeColor="text1"/>
+        </w:rPr>
+        <w:t xml:space="preserve"> produced and documented.</w:t>
       </w:r>
     </w:p>
     <w:p>
@@ -4029,7 +4000,6 @@
         <w:rPr>
           <w:color w:val="000000" w:themeColor="text1"/>
         </w:rPr>
-        <w:lastRenderedPageBreak/>
         <w:t>The implementation demonstrates an enterprise-style solution and is not assumed to be a complete production deployment.</w:t>
       </w:r>
     </w:p>
@@ -4604,6 +4574,7 @@
               <w:rPr>
                 <w:color w:val="000000" w:themeColor="text1"/>
               </w:rPr>
+              <w:lastRenderedPageBreak/>
               <w:t>Incomplete evidence</w:t>
             </w:r>
           </w:p>
@@ -4804,8 +4775,35 @@
         <w:rPr>
           <w:color w:val="000000" w:themeColor="text1"/>
         </w:rPr>
-        <w:lastRenderedPageBreak/>
-        <w:t>The enterprise repository structure specified by the project includes docs/, config/, datasets/, bronze/, silver/, gold/, pentaho/, python/, sql/, metadata/, lineage/, dashboards/, deployment/, tests/ and README.md.</w:t>
+        <w:t xml:space="preserve">The enterprise repository structure specified by the project includes docs/, config/, datasets/, bronze/, silver/, gold/, </w:t>
+      </w:r>
+      <w:proofErr w:type="spellStart"/>
+      <w:r>
+        <w:rPr>
+          <w:color w:val="000000" w:themeColor="text1"/>
+        </w:rPr>
+        <w:t>pentaho</w:t>
+      </w:r>
+      <w:proofErr w:type="spellEnd"/>
+      <w:r>
+        <w:rPr>
+          <w:color w:val="000000" w:themeColor="text1"/>
+        </w:rPr>
+        <w:t xml:space="preserve">/, python/, </w:t>
+      </w:r>
+      <w:proofErr w:type="spellStart"/>
+      <w:r>
+        <w:rPr>
+          <w:color w:val="000000" w:themeColor="text1"/>
+        </w:rPr>
+        <w:t>sql</w:t>
+      </w:r>
+      <w:proofErr w:type="spellEnd"/>
+      <w:r>
+        <w:rPr>
+          <w:color w:val="000000" w:themeColor="text1"/>
+        </w:rPr>
+        <w:t>/, metadata/, lineage/, dashboards/, deployment/, tests/ and README.md.</w:t>
       </w:r>
     </w:p>
     <w:p>

</xml_diff>